<commit_message>
Phase II Update 20260306 1800
</commit_message>
<xml_diff>
--- a/GOSL GHR SmartStream HCM Interface.docx
+++ b/GOSL GHR SmartStream HCM Interface.docx
@@ -6687,30 +6687,60 @@
                 <w:b w:val="0"/>
                 <w:bCs w:val="0"/>
               </w:rPr>
-              <w:t>Stored Procedure Request – USP_SEL_EMPLOYEE_EVENTS</w:t>
-            </w:r>
-          </w:p>
-        </w:tc>
-      </w:tr>
-      <w:tr>
-        <w:tc>
-          <w:tcPr>
-            <w:cnfStyle w:val="001000000000" w:firstRow="0" w:lastRow="0" w:firstColumn="1" w:lastColumn="0" w:oddVBand="0" w:evenVBand="0" w:oddHBand="0" w:evenHBand="0" w:firstRowFirstColumn="0" w:firstRowLastColumn="0" w:lastRowFirstColumn="0" w:lastRowLastColumn="0"/>
-            <w:tcW w:w="5575" w:type="dxa"/>
-          </w:tcPr>
-          <w:p>
-            <w:pPr>
+              <w:t xml:space="preserve">Stored Procedure Request - </w:t>
+            </w:r>
+            <w:r>
               <w:rPr>
                 <w:b w:val="0"/>
                 <w:bCs w:val="0"/>
               </w:rPr>
-            </w:pPr>
-            <w:r>
+              <w:t>USP_VAL_GHR_INT_BULKCOPY</w:t>
+            </w:r>
+          </w:p>
+        </w:tc>
+      </w:tr>
+      <w:tr>
+        <w:tc>
+          <w:tcPr>
+            <w:cnfStyle w:val="001000000000" w:firstRow="0" w:lastRow="0" w:firstColumn="1" w:lastColumn="0" w:oddVBand="0" w:evenVBand="0" w:oddHBand="0" w:evenHBand="0" w:firstRowFirstColumn="0" w:firstRowLastColumn="0" w:lastRowFirstColumn="0" w:lastRowLastColumn="0"/>
+            <w:tcW w:w="5575" w:type="dxa"/>
+          </w:tcPr>
+          <w:p>
+            <w:pPr>
               <w:rPr>
                 <w:b w:val="0"/>
                 <w:bCs w:val="0"/>
               </w:rPr>
+            </w:pPr>
+            <w:r>
+              <w:rPr>
+                <w:b w:val="0"/>
+                <w:bCs w:val="0"/>
+              </w:rPr>
               <w:lastRenderedPageBreak/>
+              <w:t>Stored Procedure Request – USP_SEL_EMPLOYEE_EVENTS</w:t>
+            </w:r>
+          </w:p>
+        </w:tc>
+      </w:tr>
+      <w:tr>
+        <w:tc>
+          <w:tcPr>
+            <w:cnfStyle w:val="001000000000" w:firstRow="0" w:lastRow="0" w:firstColumn="1" w:lastColumn="0" w:oddVBand="0" w:evenVBand="0" w:oddHBand="0" w:evenHBand="0" w:firstRowFirstColumn="0" w:firstRowLastColumn="0" w:lastRowFirstColumn="0" w:lastRowLastColumn="0"/>
+            <w:tcW w:w="5575" w:type="dxa"/>
+          </w:tcPr>
+          <w:p>
+            <w:pPr>
+              <w:rPr>
+                <w:b w:val="0"/>
+                <w:bCs w:val="0"/>
+              </w:rPr>
+            </w:pPr>
+            <w:r>
+              <w:rPr>
+                <w:b w:val="0"/>
+                <w:bCs w:val="0"/>
+              </w:rPr>
               <w:t>Stored Procedure Request – USP_VERIFICATION_RPT_CSV</w:t>
             </w:r>
           </w:p>
@@ -7284,6 +7314,38 @@
           </w:p>
         </w:tc>
       </w:tr>
+      <w:tr>
+        <w:tc>
+          <w:tcPr>
+            <w:cnfStyle w:val="001000000000" w:firstRow="0" w:lastRow="0" w:firstColumn="1" w:lastColumn="0" w:oddVBand="0" w:evenVBand="0" w:oddHBand="0" w:evenHBand="0" w:firstRowFirstColumn="0" w:firstRowLastColumn="0" w:lastRowFirstColumn="0" w:lastRowLastColumn="0"/>
+            <w:tcW w:w="4492" w:type="dxa"/>
+          </w:tcPr>
+          <w:p>
+            <w:pPr>
+              <w:rPr>
+                <w:b w:val="0"/>
+                <w:bCs w:val="0"/>
+              </w:rPr>
+            </w:pPr>
+            <w:proofErr w:type="spellStart"/>
+            <w:r>
+              <w:rPr>
+                <w:b w:val="0"/>
+                <w:bCs w:val="0"/>
+              </w:rPr>
+              <w:t>DBShrpn.dbo.</w:t>
+            </w:r>
+            <w:r>
+              <w:rPr>
+                <w:b w:val="0"/>
+                <w:bCs w:val="0"/>
+              </w:rPr>
+              <w:t>usp_ghr_int_validate_bulkcopy</w:t>
+            </w:r>
+            <w:proofErr w:type="spellEnd"/>
+          </w:p>
+        </w:tc>
+      </w:tr>
     </w:tbl>
     <w:p/>
     <w:p>
@@ -7656,6 +7718,7 @@
                 <w:b w:val="0"/>
                 <w:bCs w:val="0"/>
               </w:rPr>
+              <w:lastRenderedPageBreak/>
               <w:t>DBShrpn.dbo.</w:t>
             </w:r>
             <w:r>
@@ -7720,7 +7783,6 @@
                 <w:b w:val="0"/>
                 <w:bCs w:val="0"/>
               </w:rPr>
-              <w:lastRenderedPageBreak/>
               <w:t>DBShrpn.dbo.</w:t>
             </w:r>
             <w:r>
@@ -8093,14 +8155,11 @@
     </w:p>
     <w:p>
       <w:r>
-        <w:rPr>
-          <w:noProof/>
-        </w:rPr>
         <w:drawing>
-          <wp:inline distT="0" distB="0" distL="0" distR="0" wp14:anchorId="5BA5F96C" wp14:editId="095E7F80">
-            <wp:extent cx="4425696" cy="3154680"/>
-            <wp:effectExtent l="0" t="0" r="0" b="7620"/>
-            <wp:docPr id="1023737767" name="Picture 1" descr="A screenshot of a computer&#10;&#10;AI-generated content may be incorrect."/>
+          <wp:inline distT="0" distB="0" distL="0" distR="0" wp14:anchorId="420CFA04" wp14:editId="16769C05">
+            <wp:extent cx="3163824" cy="2267712"/>
+            <wp:effectExtent l="0" t="0" r="0" b="0"/>
+            <wp:docPr id="498284535" name="Picture 1" descr="A screenshot of a computer&#10;&#10;AI-generated content may be incorrect."/>
             <wp:cNvGraphicFramePr>
               <a:graphicFrameLocks xmlns:a="http://schemas.openxmlformats.org/drawingml/2006/main" noChangeAspect="1"/>
             </wp:cNvGraphicFramePr>
@@ -8108,7 +8167,7 @@
               <a:graphicData uri="http://schemas.openxmlformats.org/drawingml/2006/picture">
                 <pic:pic xmlns:pic="http://schemas.openxmlformats.org/drawingml/2006/picture">
                   <pic:nvPicPr>
-                    <pic:cNvPr id="1023737767" name="Picture 1" descr="A screenshot of a computer&#10;&#10;AI-generated content may be incorrect."/>
+                    <pic:cNvPr id="498284535" name="Picture 1" descr="A screenshot of a computer&#10;&#10;AI-generated content may be incorrect."/>
                     <pic:cNvPicPr/>
                   </pic:nvPicPr>
                   <pic:blipFill>
@@ -8120,7 +8179,7 @@
                   <pic:spPr>
                     <a:xfrm>
                       <a:off x="0" y="0"/>
-                      <a:ext cx="4425696" cy="3154680"/>
+                      <a:ext cx="3163824" cy="2267712"/>
                     </a:xfrm>
                     <a:prstGeom prst="rect">
                       <a:avLst/>
@@ -8133,6 +8192,7 @@
         </w:drawing>
       </w:r>
     </w:p>
+    <w:p/>
     <w:p>
       <w:pPr>
         <w:pStyle w:val="Heading3"/>
@@ -8426,7 +8486,65 @@
       <w:bookmarkStart w:id="25" w:name="_Toc220498129"/>
       <w:r>
         <w:lastRenderedPageBreak/>
-        <w:t>Step 4 – S03 Connect Stored Procedure USP_SEL_EMPLOYEE_EVENTS</w:t>
+        <w:t>Step 4 – S02 Connect Stored Procedure USP_VAL_GHR_INT_BULKCOPY</w:t>
+      </w:r>
+    </w:p>
+    <w:p>
+      <w:r>
+        <w:t>Job Scheduler Class: WIN10CLS</w:t>
+      </w:r>
+    </w:p>
+    <w:p>
+      <w:r>
+        <w:drawing>
+          <wp:inline distT="0" distB="0" distL="0" distR="0" wp14:anchorId="7DD7D258" wp14:editId="0C491050">
+            <wp:extent cx="3767328" cy="2359152"/>
+            <wp:effectExtent l="0" t="0" r="5080" b="3175"/>
+            <wp:docPr id="10080646" name="Picture 1" descr="A screenshot of a computer&#10;&#10;AI-generated content may be incorrect."/>
+            <wp:cNvGraphicFramePr>
+              <a:graphicFrameLocks xmlns:a="http://schemas.openxmlformats.org/drawingml/2006/main" noChangeAspect="1"/>
+            </wp:cNvGraphicFramePr>
+            <a:graphic xmlns:a="http://schemas.openxmlformats.org/drawingml/2006/main">
+              <a:graphicData uri="http://schemas.openxmlformats.org/drawingml/2006/picture">
+                <pic:pic xmlns:pic="http://schemas.openxmlformats.org/drawingml/2006/picture">
+                  <pic:nvPicPr>
+                    <pic:cNvPr id="10080646" name="Picture 1" descr="A screenshot of a computer&#10;&#10;AI-generated content may be incorrect."/>
+                    <pic:cNvPicPr/>
+                  </pic:nvPicPr>
+                  <pic:blipFill>
+                    <a:blip r:embed="rId16"/>
+                    <a:stretch>
+                      <a:fillRect/>
+                    </a:stretch>
+                  </pic:blipFill>
+                  <pic:spPr>
+                    <a:xfrm>
+                      <a:off x="0" y="0"/>
+                      <a:ext cx="3767328" cy="2359152"/>
+                    </a:xfrm>
+                    <a:prstGeom prst="rect">
+                      <a:avLst/>
+                    </a:prstGeom>
+                  </pic:spPr>
+                </pic:pic>
+              </a:graphicData>
+            </a:graphic>
+          </wp:inline>
+        </w:drawing>
+      </w:r>
+    </w:p>
+    <w:p>
+      <w:pPr>
+        <w:pStyle w:val="Heading3"/>
+      </w:pPr>
+      <w:r>
+        <w:t xml:space="preserve">Step </w:t>
+      </w:r>
+      <w:r>
+        <w:t>5</w:t>
+      </w:r>
+      <w:r>
+        <w:t xml:space="preserve"> – S03 Connect Stored Procedure USP_SEL_EMPLOYEE_EVENTS</w:t>
       </w:r>
       <w:bookmarkEnd w:id="24"/>
       <w:bookmarkEnd w:id="25"/>
@@ -8460,7 +8578,7 @@
                     <pic:cNvPicPr/>
                   </pic:nvPicPr>
                   <pic:blipFill>
-                    <a:blip r:embed="rId16"/>
+                    <a:blip r:embed="rId17"/>
                     <a:stretch>
                       <a:fillRect/>
                     </a:stretch>
@@ -8488,11 +8606,25 @@
     </w:p>
     <w:p>
       <w:pPr>
-        <w:pStyle w:val="Heading3"/>
+        <w:rPr>
+          <w:rFonts w:eastAsiaTheme="majorEastAsia" w:cstheme="majorBidi"/>
+          <w:b/>
+          <w:bCs/>
+          <w:color w:val="0F6FC6" w:themeColor="accent1"/>
+        </w:rPr>
       </w:pPr>
       <w:bookmarkStart w:id="26" w:name="_Toc207985120"/>
       <w:bookmarkStart w:id="27" w:name="_Toc220498130"/>
       <w:r>
+        <w:br w:type="page"/>
+      </w:r>
+    </w:p>
+    <w:p>
+      <w:pPr>
+        <w:pStyle w:val="Heading3"/>
+      </w:pPr>
+      <w:r>
+        <w:lastRenderedPageBreak/>
         <w:t xml:space="preserve">Step 5 – </w:t>
       </w:r>
       <w:bookmarkEnd w:id="26"/>
@@ -8520,6 +8652,9 @@
       </w:pPr>
       <w:r>
         <w:t>GOSL – VENUS</w:t>
+      </w:r>
+      <w:r>
+        <w:t xml:space="preserve"> Version</w:t>
       </w:r>
     </w:p>
     <w:p>
@@ -8531,9 +8666,9 @@
           <w:noProof/>
         </w:rPr>
         <w:drawing>
-          <wp:inline distT="0" distB="0" distL="0" distR="0" wp14:anchorId="2C9699E6" wp14:editId="289AC966">
-            <wp:extent cx="4041648" cy="2542032"/>
-            <wp:effectExtent l="0" t="0" r="0" b="0"/>
+          <wp:inline distT="0" distB="0" distL="0" distR="0" wp14:anchorId="2C9699E6" wp14:editId="27B3F584">
+            <wp:extent cx="3108960" cy="1956816"/>
+            <wp:effectExtent l="0" t="0" r="0" b="5715"/>
             <wp:docPr id="1365365248" name="Picture 1" descr="A screenshot of a computer&#10;&#10;AI-generated content may be incorrect."/>
             <wp:cNvGraphicFramePr>
               <a:graphicFrameLocks xmlns:a="http://schemas.openxmlformats.org/drawingml/2006/main" noChangeAspect="1"/>
@@ -8546,7 +8681,7 @@
                     <pic:cNvPicPr/>
                   </pic:nvPicPr>
                   <pic:blipFill>
-                    <a:blip r:embed="rId17"/>
+                    <a:blip r:embed="rId18"/>
                     <a:stretch>
                       <a:fillRect/>
                     </a:stretch>
@@ -8554,7 +8689,7 @@
                   <pic:spPr>
                     <a:xfrm>
                       <a:off x="0" y="0"/>
-                      <a:ext cx="4041648" cy="2542032"/>
+                      <a:ext cx="3108960" cy="1956816"/>
                     </a:xfrm>
                     <a:prstGeom prst="rect">
                       <a:avLst/>
@@ -8575,7 +8710,13 @@
         <w:t xml:space="preserve">Server Filename: </w:t>
       </w:r>
       <w:r>
-        <w:t>C:\Maildir\</w:t>
+        <w:t>C:\</w:t>
+      </w:r>
+      <w:r>
+        <w:t>Reports</w:t>
+      </w:r>
+      <w:r>
+        <w:t>\</w:t>
       </w:r>
       <w:r>
         <w:t>vhcmrpt_venus</w:t>
@@ -8590,53 +8731,17 @@
       <w:pPr>
         <w:spacing w:after="0"/>
       </w:pPr>
-    </w:p>
-    <w:p>
-      <w:pPr>
-        <w:spacing w:after="0"/>
-      </w:pPr>
-    </w:p>
-    <w:p>
-      <w:pPr>
-        <w:spacing w:after="0"/>
-      </w:pPr>
-    </w:p>
-    <w:p>
-      <w:pPr>
-        <w:spacing w:after="0"/>
-      </w:pPr>
-    </w:p>
-    <w:p>
-      <w:pPr>
-        <w:spacing w:after="0"/>
-      </w:pPr>
-    </w:p>
-    <w:p>
-      <w:pPr>
-        <w:spacing w:after="0"/>
-      </w:pPr>
-    </w:p>
-    <w:p>
-      <w:pPr>
-        <w:spacing w:after="0"/>
-      </w:pPr>
-    </w:p>
-    <w:p>
-      <w:pPr>
-        <w:spacing w:after="0"/>
-      </w:pPr>
-    </w:p>
-    <w:p>
-      <w:pPr>
-        <w:spacing w:after="0"/>
-      </w:pPr>
-    </w:p>
-    <w:p>
-      <w:pPr>
-        <w:spacing w:after="0"/>
-      </w:pPr>
-      <w:r>
-        <w:t>GOSL - FORT</w:t>
+      <w:r>
+        <w:t xml:space="preserve">GOSL </w:t>
+      </w:r>
+      <w:r>
+        <w:t>–</w:t>
+      </w:r>
+      <w:r>
+        <w:t xml:space="preserve"> FORT</w:t>
+      </w:r>
+      <w:r>
+        <w:t xml:space="preserve"> Version</w:t>
       </w:r>
     </w:p>
     <w:p>
@@ -8653,9 +8758,9 @@
           <w:noProof/>
         </w:rPr>
         <w:drawing>
-          <wp:inline distT="0" distB="0" distL="0" distR="0" wp14:anchorId="552D1469" wp14:editId="3D74EF7D">
-            <wp:extent cx="4069080" cy="2542032"/>
-            <wp:effectExtent l="0" t="0" r="7620" b="0"/>
+          <wp:inline distT="0" distB="0" distL="0" distR="0" wp14:anchorId="552D1469" wp14:editId="3DDE966E">
+            <wp:extent cx="3136392" cy="1956816"/>
+            <wp:effectExtent l="0" t="0" r="6985" b="5715"/>
             <wp:docPr id="1762472331" name="Picture 1" descr="A screenshot of a computer&#10;&#10;AI-generated content may be incorrect."/>
             <wp:cNvGraphicFramePr>
               <a:graphicFrameLocks xmlns:a="http://schemas.openxmlformats.org/drawingml/2006/main" noChangeAspect="1"/>
@@ -8668,7 +8773,7 @@
                     <pic:cNvPicPr/>
                   </pic:nvPicPr>
                   <pic:blipFill>
-                    <a:blip r:embed="rId18"/>
+                    <a:blip r:embed="rId19"/>
                     <a:stretch>
                       <a:fillRect/>
                     </a:stretch>
@@ -8676,7 +8781,7 @@
                   <pic:spPr>
                     <a:xfrm>
                       <a:off x="0" y="0"/>
-                      <a:ext cx="4069080" cy="2542032"/>
+                      <a:ext cx="3136392" cy="1956816"/>
                     </a:xfrm>
                     <a:prstGeom prst="rect">
                       <a:avLst/>
@@ -8697,7 +8802,10 @@
         <w:t xml:space="preserve">Server Filename: </w:t>
       </w:r>
       <w:r>
-        <w:t>C:\Maildir</w:t>
+        <w:t>C:\</w:t>
+      </w:r>
+      <w:r>
+        <w:t>Reports</w:t>
       </w:r>
       <w:r>
         <w:t>\vhcmrpt_fort</w:t>
@@ -8731,6 +8839,7 @@
         <w:rPr>
           <w:noProof/>
         </w:rPr>
+        <w:lastRenderedPageBreak/>
         <w:drawing>
           <wp:inline distT="0" distB="0" distL="0" distR="0" wp14:anchorId="764D7E0F" wp14:editId="15EA062E">
             <wp:extent cx="4032504" cy="1700784"/>
@@ -8747,7 +8856,7 @@
                     <pic:cNvPicPr/>
                   </pic:nvPicPr>
                   <pic:blipFill>
-                    <a:blip r:embed="rId19"/>
+                    <a:blip r:embed="rId20"/>
                     <a:stretch>
                       <a:fillRect/>
                     </a:stretch>
@@ -9548,7 +9657,7 @@
                     <pic:cNvPicPr/>
                   </pic:nvPicPr>
                   <pic:blipFill>
-                    <a:blip r:embed="rId20"/>
+                    <a:blip r:embed="rId21"/>
                     <a:stretch>
                       <a:fillRect/>
                     </a:stretch>
@@ -41066,7 +41175,7 @@
                     <pic:cNvPicPr/>
                   </pic:nvPicPr>
                   <pic:blipFill>
-                    <a:blip r:embed="rId21"/>
+                    <a:blip r:embed="rId22"/>
                     <a:stretch>
                       <a:fillRect/>
                     </a:stretch>
@@ -41129,7 +41238,7 @@
                     <pic:cNvPicPr/>
                   </pic:nvPicPr>
                   <pic:blipFill>
-                    <a:blip r:embed="rId22"/>
+                    <a:blip r:embed="rId23"/>
                     <a:stretch>
                       <a:fillRect/>
                     </a:stretch>
@@ -41220,7 +41329,7 @@
                     <pic:cNvPicPr/>
                   </pic:nvPicPr>
                   <pic:blipFill>
-                    <a:blip r:embed="rId23"/>
+                    <a:blip r:embed="rId24"/>
                     <a:stretch>
                       <a:fillRect/>
                     </a:stretch>
@@ -41303,7 +41412,7 @@
                     <pic:cNvPicPr/>
                   </pic:nvPicPr>
                   <pic:blipFill>
-                    <a:blip r:embed="rId24"/>
+                    <a:blip r:embed="rId25"/>
                     <a:stretch>
                       <a:fillRect/>
                     </a:stretch>
@@ -41376,7 +41485,7 @@
                     </pic:cNvPicPr>
                   </pic:nvPicPr>
                   <pic:blipFill>
-                    <a:blip r:embed="rId25" cstate="print">
+                    <a:blip r:embed="rId26" cstate="print">
                       <a:extLst>
                         <a:ext uri="{28A0092B-C50C-407E-A947-70E740481C1C}">
                           <a14:useLocalDpi xmlns:a14="http://schemas.microsoft.com/office/drawing/2010/main" val="0"/>
@@ -41416,12 +41525,12 @@
       </w:pPr>
     </w:p>
     <w:sectPr>
-      <w:headerReference w:type="even" r:id="rId26"/>
-      <w:headerReference w:type="default" r:id="rId27"/>
-      <w:footerReference w:type="even" r:id="rId28"/>
-      <w:footerReference w:type="default" r:id="rId29"/>
-      <w:headerReference w:type="first" r:id="rId30"/>
-      <w:footerReference w:type="first" r:id="rId31"/>
+      <w:headerReference w:type="even" r:id="rId27"/>
+      <w:headerReference w:type="default" r:id="rId28"/>
+      <w:footerReference w:type="even" r:id="rId29"/>
+      <w:footerReference w:type="default" r:id="rId30"/>
+      <w:headerReference w:type="first" r:id="rId31"/>
+      <w:footerReference w:type="first" r:id="rId32"/>
       <w:pgSz w:w="12240" w:h="15840"/>
       <w:pgMar w:top="1440" w:right="1440" w:bottom="1440" w:left="1440" w:header="720" w:footer="720" w:gutter="0"/>
       <w:cols w:space="720"/>
@@ -47506,7 +47615,7 @@
   <w:style w:type="paragraph" w:default="1" w:styleId="Normal">
     <w:name w:val="Normal"/>
     <w:qFormat/>
-    <w:rsid w:val="00B71C9D"/>
+    <w:rsid w:val="00B8396B"/>
     <w:rPr>
       <w:rFonts w:ascii="Calibri Light" w:hAnsi="Calibri Light"/>
     </w:rPr>
@@ -47651,7 +47760,6 @@
   <w:style w:type="character" w:default="1" w:styleId="DefaultParagraphFont">
     <w:name w:val="Default Paragraph Font"/>
     <w:uiPriority w:val="1"/>
-    <w:semiHidden/>
     <w:unhideWhenUsed/>
   </w:style>
   <w:style w:type="table" w:default="1" w:styleId="TableNormal">
@@ -48976,6 +49084,10 @@
 </file>
 
 <file path=customXml/item1.xml><?xml version="1.0" encoding="utf-8"?>
+<b:Sources xmlns:b="http://schemas.openxmlformats.org/officeDocument/2006/bibliography" xmlns="http://schemas.openxmlformats.org/officeDocument/2006/bibliography" SelectedStyle="\APA.XSL" StyleName="APA"/>
+</file>
+
+<file path=customXml/item2.xml><?xml version="1.0" encoding="utf-8"?>
 <ct:contentTypeSchema xmlns:ct="http://schemas.microsoft.com/office/2006/metadata/contentType" xmlns:ma="http://schemas.microsoft.com/office/2006/metadata/properties/metaAttributes" ct:_="" ma:_="" ma:contentTypeName="Document" ma:contentTypeID="0x010100A3F9B06FA7805D49937E3E9F547B2278" ma:contentTypeVersion="8" ma:contentTypeDescription="Create a new document." ma:contentTypeScope="" ma:versionID="b09c8142e975a6a49e572717d2769d37">
   <xsd:schema xmlns:xsd="http://www.w3.org/2001/XMLSchema" xmlns:xs="http://www.w3.org/2001/XMLSchema" xmlns:p="http://schemas.microsoft.com/office/2006/metadata/properties" xmlns:ns2="47ffb37d-1e77-4231-a96d-a12ae1881b6d" xmlns:ns3="5c7dcda1-90e0-44df-a883-f694d302d96a" targetNamespace="http://schemas.microsoft.com/office/2006/metadata/properties" ma:root="true" ma:fieldsID="43b30181b36c17dac59f3abcf9d058be" ns2:_="" ns3:_="">
     <xsd:import namespace="47ffb37d-1e77-4231-a96d-a12ae1881b6d"/>
@@ -49166,11 +49278,13 @@
 </ct:contentTypeSchema>
 </file>
 
-<file path=customXml/item2.xml><?xml version="1.0" encoding="utf-8"?>
-<b:Sources xmlns:b="http://schemas.openxmlformats.org/officeDocument/2006/bibliography" xmlns="http://schemas.openxmlformats.org/officeDocument/2006/bibliography" SelectedStyle="\APA.XSL" StyleName="APA"/>
+<file path=customXml/item3.xml><?xml version="1.0" encoding="utf-8"?>
+<p:properties xmlns:p="http://schemas.microsoft.com/office/2006/metadata/properties" xmlns:xsi="http://www.w3.org/2001/XMLSchema-instance" xmlns:pc="http://schemas.microsoft.com/office/infopath/2007/PartnerControls">
+  <documentManagement/>
+</p:properties>
 </file>
 
-<file path=customXml/item3.xml><?xml version="1.0" encoding="utf-8"?>
+<file path=customXml/item4.xml><?xml version="1.0" encoding="utf-8"?>
 <?mso-contentType ?>
 <FormTemplates xmlns="http://schemas.microsoft.com/sharepoint/v3/contenttype/forms">
   <Display>DocumentLibraryForm</Display>
@@ -49179,13 +49293,15 @@
 </FormTemplates>
 </file>
 
-<file path=customXml/item4.xml><?xml version="1.0" encoding="utf-8"?>
-<p:properties xmlns:p="http://schemas.microsoft.com/office/2006/metadata/properties" xmlns:xsi="http://www.w3.org/2001/XMLSchema-instance" xmlns:pc="http://schemas.microsoft.com/office/infopath/2007/PartnerControls">
-  <documentManagement/>
-</p:properties>
+<file path=customXml/itemProps1.xml><?xml version="1.0" encoding="utf-8"?>
+<ds:datastoreItem xmlns:ds="http://schemas.openxmlformats.org/officeDocument/2006/customXml" ds:itemID="{BADC8323-39B8-49DE-BFA5-24914E6F6F5C}">
+  <ds:schemaRefs>
+    <ds:schemaRef ds:uri="http://schemas.openxmlformats.org/officeDocument/2006/bibliography"/>
+  </ds:schemaRefs>
+</ds:datastoreItem>
 </file>
 
-<file path=customXml/itemProps1.xml><?xml version="1.0" encoding="utf-8"?>
+<file path=customXml/itemProps2.xml><?xml version="1.0" encoding="utf-8"?>
 <ds:datastoreItem xmlns:ds="http://schemas.openxmlformats.org/officeDocument/2006/customXml" ds:itemID="{D81EAD54-3ACA-48DF-9DEC-EEA3EDABB7B7}">
   <ds:schemaRefs>
     <ds:schemaRef ds:uri="http://schemas.microsoft.com/office/2006/metadata/contentType"/>
@@ -49204,27 +49320,19 @@
 </ds:datastoreItem>
 </file>
 
-<file path=customXml/itemProps2.xml><?xml version="1.0" encoding="utf-8"?>
-<ds:datastoreItem xmlns:ds="http://schemas.openxmlformats.org/officeDocument/2006/customXml" ds:itemID="{BADC8323-39B8-49DE-BFA5-24914E6F6F5C}">
-  <ds:schemaRefs>
-    <ds:schemaRef ds:uri="http://schemas.openxmlformats.org/officeDocument/2006/bibliography"/>
-  </ds:schemaRefs>
-</ds:datastoreItem>
-</file>
-
 <file path=customXml/itemProps3.xml><?xml version="1.0" encoding="utf-8"?>
-<ds:datastoreItem xmlns:ds="http://schemas.openxmlformats.org/officeDocument/2006/customXml" ds:itemID="{84357376-D025-4BCE-B575-D381D41FB452}">
-  <ds:schemaRefs>
-    <ds:schemaRef ds:uri="http://schemas.microsoft.com/sharepoint/v3/contenttype/forms"/>
-  </ds:schemaRefs>
-</ds:datastoreItem>
-</file>
-
-<file path=customXml/itemProps4.xml><?xml version="1.0" encoding="utf-8"?>
 <ds:datastoreItem xmlns:ds="http://schemas.openxmlformats.org/officeDocument/2006/customXml" ds:itemID="{838147C0-C298-4855-91B0-A2D11E23B762}">
   <ds:schemaRefs>
     <ds:schemaRef ds:uri="http://schemas.microsoft.com/office/2006/metadata/properties"/>
     <ds:schemaRef ds:uri="http://schemas.microsoft.com/office/infopath/2007/PartnerControls"/>
   </ds:schemaRefs>
 </ds:datastoreItem>
+</file>
+
+<file path=customXml/itemProps4.xml><?xml version="1.0" encoding="utf-8"?>
+<ds:datastoreItem xmlns:ds="http://schemas.openxmlformats.org/officeDocument/2006/customXml" ds:itemID="{84357376-D025-4BCE-B575-D381D41FB452}">
+  <ds:schemaRefs>
+    <ds:schemaRef ds:uri="http://schemas.microsoft.com/sharepoint/v3/contenttype/forms"/>
+  </ds:schemaRefs>
+</ds:datastoreItem>
 </file>
</xml_diff>